<commit_message>
Make resumes ATS-friendly and fill keyword gaps
- Header as plain text, not a table (parsers skip table cells)
- Drop photo by default (INCLUDE_PHOTO flag) and '(XC)' from the name line
- 'Work Experience' heading for reliable section parsing
- Add literal keywords recruiters filter on: HTML5, CSS3, CI/CD, unit testing,
  Agile/Scrum, code review, responsive design, AWS, 'Frontend developer'

Co-Authored-By: Claude Opus 5.5 <noreply@anthropic.com>
Claude-Session: https://claude.ai/code/session_01LZTD6VJkD1TQerAHndVhy5
</commit_message>
<xml_diff>
--- a/public/XCResume-fullstack.docx
+++ b/public/XCResume-fullstack.docx
@@ -2,90 +2,32 @@
 <file path=word/document.xml><?xml version="1.0" encoding="utf-8"?>
 <w:document xmlns:wpc="http://schemas.microsoft.com/office/word/2010/wordprocessingCanvas" xmlns:mo="http://schemas.microsoft.com/office/mac/office/2008/main" xmlns:mc="http://schemas.openxmlformats.org/markup-compatibility/2006" xmlns:mv="urn:schemas-microsoft-com:mac:vml" xmlns:o="urn:schemas-microsoft-com:office:office" xmlns:r="http://schemas.openxmlformats.org/officeDocument/2006/relationships" xmlns:m="http://schemas.openxmlformats.org/officeDocument/2006/math" xmlns:v="urn:schemas-microsoft-com:vml" xmlns:wp14="http://schemas.microsoft.com/office/word/2010/wordprocessingDrawing" xmlns:wp="http://schemas.openxmlformats.org/drawingml/2006/wordprocessingDrawing" xmlns:w10="urn:schemas-microsoft-com:office:word" xmlns:w="http://schemas.openxmlformats.org/wordprocessingml/2006/main" xmlns:w14="http://schemas.microsoft.com/office/word/2010/wordml" xmlns:wpg="http://schemas.microsoft.com/office/word/2010/wordprocessingGroup" xmlns:wpi="http://schemas.microsoft.com/office/word/2010/wordprocessingInk" xmlns:wne="http://schemas.microsoft.com/office/word/2006/wordml" xmlns:wps="http://schemas.microsoft.com/office/word/2010/wordprocessingShape" mc:Ignorable="w14 wp14">
   <w:body>
-    <w:tbl>
-      <w:tblPr>
-        <w:tblW w:type="auto" w:w="0"/>
-        <w:tblLook w:firstColumn="1" w:firstRow="1" w:lastColumn="0" w:lastRow="0" w:noHBand="0" w:noVBand="1" w:val="04A0"/>
-      </w:tblPr>
-      <w:tblGrid>
-        <w:gridCol w:w="5112"/>
-        <w:gridCol w:w="5112"/>
-      </w:tblGrid>
-      <w:tr>
-        <w:tc>
-          <w:tcPr>
-            <w:tcW w:type="dxa" w:w="1872"/>
-          </w:tcPr>
-          <w:p>
-            <w:r>
-              <w:drawing>
-                <wp:inline xmlns:a="http://schemas.openxmlformats.org/drawingml/2006/main" xmlns:pic="http://schemas.openxmlformats.org/drawingml/2006/picture">
-                  <wp:extent cx="1005840" cy="1005840"/>
-                  <wp:docPr id="1" name="Picture 1"/>
-                  <wp:cNvGraphicFramePr>
-                    <a:graphicFrameLocks noChangeAspect="1"/>
-                  </wp:cNvGraphicFramePr>
-                  <a:graphic>
-                    <a:graphicData uri="http://schemas.openxmlformats.org/drawingml/2006/picture">
-                      <pic:pic>
-                        <pic:nvPicPr>
-                          <pic:cNvPr id="0" name="image.jpg"/>
-                          <pic:cNvPicPr/>
-                        </pic:nvPicPr>
-                        <pic:blipFill>
-                          <a:blip r:embed="rId9"/>
-                          <a:stretch>
-                            <a:fillRect/>
-                          </a:stretch>
-                        </pic:blipFill>
-                        <pic:spPr>
-                          <a:xfrm>
-                            <a:off x="0" y="0"/>
-                            <a:ext cx="1005840" cy="1005840"/>
-                          </a:xfrm>
-                          <a:prstGeom prst="rect"/>
-                        </pic:spPr>
-                      </pic:pic>
-                    </a:graphicData>
-                  </a:graphic>
-                </wp:inline>
-              </w:drawing>
-            </w:r>
-          </w:p>
-        </w:tc>
-        <w:tc>
-          <w:tcPr>
-            <w:tcW w:type="dxa" w:w="8352"/>
-          </w:tcPr>
-          <w:p>
-            <w:r>
-              <w:rPr>
-                <w:b/>
-                <w:sz w:val="36"/>
-              </w:rPr>
-              <w:t>Exiequielle John Frias (XC)</w:t>
-            </w:r>
-          </w:p>
-          <w:p>
-            <w:r>
-              <w:rPr>
-                <w:color w:val="4C1D95"/>
-                <w:sz w:val="23"/>
-              </w:rPr>
-              <w:t>Full-Stack Engineer  |  Vue/Nuxt + Python</w:t>
-            </w:r>
-          </w:p>
-          <w:p>
-            <w:r>
-              <w:rPr>
-                <w:sz w:val="18"/>
-              </w:rPr>
-              <w:t>Manila, Philippines  |  frias.exiequiellejohn@gmail.com  |  xcworks.vercel.app  |  linkedin.com/in/exiequielle-john  |  github.com/jagwaw</w:t>
-            </w:r>
-          </w:p>
-        </w:tc>
-      </w:tr>
-    </w:tbl>
+    <w:p>
+      <w:r>
+        <w:rPr>
+          <w:b/>
+          <w:sz w:val="36"/>
+        </w:rPr>
+        <w:t>Exiequielle John Frias</w:t>
+      </w:r>
+    </w:p>
+    <w:p>
+      <w:r>
+        <w:rPr>
+          <w:color w:val="4C1D95"/>
+          <w:sz w:val="23"/>
+        </w:rPr>
+        <w:t>Full-Stack Engineer  |  Vue/Nuxt + Python</w:t>
+      </w:r>
+    </w:p>
+    <w:p>
+      <w:r>
+        <w:rPr>
+          <w:sz w:val="18"/>
+        </w:rPr>
+        <w:t>Manila, Philippines  |  frias.exiequiellejohn@gmail.com  |  xcworks.vercel.app  |  linkedin.com/in/exiequielle-john  |  github.com/jagwaw</w:t>
+      </w:r>
+    </w:p>
     <w:p>
       <w:pPr>
         <w:spacing w:before="160" w:after="40"/>
@@ -101,7 +43,7 @@
     </w:p>
     <w:p>
       <w:r>
-        <w:t>Full-stack engineer with 8+ years across Vue/Nuxt frontends and Python backends. I've written Python professionally since 2018: Flask and PostgreSQL APIs, a Python 2.7 to 3.7 migration onto FastAPI, and production Django REST APIs at BillEase, a Philippine fintech, where I also build KYC, payments, and credit products end to end. I build with Claude Code, Cursor, and MCP every day.</w:t>
+        <w:t>Full-stack developer with 8+ years across Vue/Nuxt frontends and Python backends. I've written Python professionally since 2018: Flask and PostgreSQL APIs, a Python 2.7 to 3.7 migration onto FastAPI, and production Django REST APIs at BillEase, a Philippine fintech, where I also build KYC, payments, and credit products end to end. I build with Claude Code, Cursor, and MCP every day.</w:t>
       </w:r>
     </w:p>
     <w:p>
@@ -136,7 +78,7 @@
         <w:t xml:space="preserve">Frontend: </w:t>
       </w:r>
       <w:r>
-        <w:t>Vue.js, Nuxt.js, TypeScript, Vuex, Tailwind CSS, Firebase, WebSocket, React</w:t>
+        <w:t>Vue.js, Nuxt.js, TypeScript, JavaScript, HTML5, CSS3, Tailwind CSS, Vuex, Firebase, WebSocket, React</w:t>
       </w:r>
     </w:p>
     <w:p>
@@ -147,7 +89,7 @@
         <w:t xml:space="preserve">Data &amp; infra: </w:t>
       </w:r>
       <w:r>
-        <w:t>PostgreSQL, MySQL, Redis, Docker, Nginx, AWS, GitLab CI, Linux</w:t>
+        <w:t>PostgreSQL, MySQL, Redis, Docker, Nginx, AWS, CI/CD (GitLab CI), Linux, Git</w:t>
       </w:r>
     </w:p>
     <w:p>
@@ -162,6 +104,17 @@
       </w:r>
     </w:p>
     <w:p>
+      <w:r>
+        <w:rPr>
+          <w:b/>
+        </w:rPr>
+        <w:t xml:space="preserve">Practices: </w:t>
+      </w:r>
+      <w:r>
+        <w:t>REST API design, unit testing, code review, Agile/Scrum</w:t>
+      </w:r>
+    </w:p>
+    <w:p>
       <w:pPr>
         <w:spacing w:before="160" w:after="40"/>
       </w:pPr>
@@ -171,7 +124,7 @@
           <w:color w:val="4C1D95"/>
           <w:sz w:val="21"/>
         </w:rPr>
-        <w:t>EXPERIENCE</w:t>
+        <w:t>WORK EXPERIENCE</w:t>
       </w:r>
     </w:p>
     <w:p>

</xml_diff>